<commit_message>
Update 仕様書 & Create Scenario
</commit_message>
<xml_diff>
--- a/3DRPGゲーム仕様書.docx
+++ b/3DRPGゲーム仕様書.docx
@@ -21,15 +21,24 @@
     <w:p>
       <w:pPr>
         <w:pStyle w:val="a5"/>
-        <w:rPr>
-          <w:rFonts w:hint="eastAsia"/>
-        </w:rPr>
-      </w:pPr>
-      <w:r>
-        <w:rPr>
-          <w:rFonts w:hint="eastAsia"/>
-        </w:rPr>
-        <w:t>5/27更新</w:t>
+      </w:pPr>
+      <w:r>
+        <w:rPr>
+          <w:rFonts w:hint="eastAsia"/>
+        </w:rPr>
+        <w:t>5/2</w:t>
+      </w:r>
+      <w:r>
+        <w:rPr>
+          <w:rFonts w:hint="eastAsia"/>
+        </w:rPr>
+        <w:t>8</w:t>
+      </w:r>
+      <w:r>
+        <w:rPr>
+          <w:rFonts w:hint="eastAsia"/>
+        </w:rPr>
+        <w:t>更新</w:t>
       </w:r>
     </w:p>
     <w:p>
@@ -2222,7 +2231,7 @@
     <w:p>
       <w:pPr>
         <w:numPr>
-          <w:ilvl w:val="0"/>
+          <w:ilvl w:val="2"/>
           <w:numId w:val="22"/>
         </w:numPr>
       </w:pPr>
@@ -2231,7 +2240,107 @@
           <w:rFonts w:hint="eastAsia"/>
         </w:rPr>
         <w:lastRenderedPageBreak/>
-        <w:t>総合プレイヤーステータスの計算(Statusクラス)</w:t>
+        <w:t>ポップ処理</w:t>
+      </w:r>
+    </w:p>
+    <w:p>
+      <w:pPr>
+        <w:numPr>
+          <w:ilvl w:val="3"/>
+          <w:numId w:val="22"/>
+        </w:numPr>
+      </w:pPr>
+      <w:r>
+        <w:rPr>
+          <w:rFonts w:hint="eastAsia"/>
+        </w:rPr>
+        <w:t>指定座標に出現。</w:t>
+      </w:r>
+    </w:p>
+    <w:p>
+      <w:pPr>
+        <w:numPr>
+          <w:ilvl w:val="2"/>
+          <w:numId w:val="22"/>
+        </w:numPr>
+      </w:pPr>
+      <w:r>
+        <w:rPr>
+          <w:rFonts w:hint="eastAsia"/>
+        </w:rPr>
+        <w:t>やられ処理。</w:t>
+      </w:r>
+    </w:p>
+    <w:p>
+      <w:pPr>
+        <w:numPr>
+          <w:ilvl w:val="3"/>
+          <w:numId w:val="22"/>
+        </w:numPr>
+      </w:pPr>
+      <w:r>
+        <w:rPr>
+          <w:rFonts w:hint="eastAsia"/>
+        </w:rPr>
+        <w:t>アイテムドロップ：</w:t>
+      </w:r>
+      <w:r>
+        <w:rPr>
+          <w:rFonts w:hint="eastAsia"/>
+        </w:rPr>
+        <w:t>Inventoryクラスを参照しアイテムを追加</w:t>
+      </w:r>
+      <w:r>
+        <w:rPr>
+          <w:rFonts w:hint="eastAsia"/>
+        </w:rPr>
+        <w:t>。</w:t>
+      </w:r>
+    </w:p>
+    <w:p>
+      <w:pPr>
+        <w:numPr>
+          <w:ilvl w:val="3"/>
+          <w:numId w:val="22"/>
+        </w:numPr>
+      </w:pPr>
+      <w:r>
+        <w:rPr>
+          <w:rFonts w:hint="eastAsia"/>
+        </w:rPr>
+        <w:t>経験値</w:t>
+      </w:r>
+      <w:r>
+        <w:rPr>
+          <w:rFonts w:hint="eastAsia"/>
+        </w:rPr>
+        <w:t>：</w:t>
+      </w:r>
+      <w:r>
+        <w:rPr>
+          <w:rFonts w:hint="eastAsia"/>
+        </w:rPr>
+        <w:t>プレイヤーを参照し</w:t>
+      </w:r>
+      <w:r>
+        <w:rPr>
+          <w:rFonts w:hint="eastAsia"/>
+        </w:rPr>
+        <w:t>経験値を付与。</w:t>
+      </w:r>
+    </w:p>
+    <w:p>
+      <w:pPr>
+        <w:numPr>
+          <w:ilvl w:val="0"/>
+          <w:numId w:val="22"/>
+        </w:numPr>
+      </w:pPr>
+      <w:r>
+        <w:rPr>
+          <w:rFonts w:hint="eastAsia"/>
+        </w:rPr>
+        <w:t>プレイヤー</w:t>
       </w:r>
     </w:p>
     <w:p>
@@ -2245,24 +2354,13 @@
         <w:rPr>
           <w:rFonts w:hint="eastAsia"/>
         </w:rPr>
-        <w:t>プレイヤーを引数に指定。そのプレイヤーの基礎ステータス、装備、バフを総合したステータスを返す。</w:t>
-      </w:r>
-    </w:p>
-    <w:p>
-      <w:pPr>
-        <w:ind w:left="1440"/>
-      </w:pPr>
-      <w:r>
-        <w:rPr>
-          <w:rFonts w:hint="eastAsia"/>
-        </w:rPr>
-        <w:t>※バフは実装してから。</w:t>
-      </w:r>
-    </w:p>
-    <w:p>
-      <w:pPr>
-        <w:numPr>
-          <w:ilvl w:val="0"/>
+        <w:t>レベル</w:t>
+      </w:r>
+    </w:p>
+    <w:p>
+      <w:pPr>
+        <w:numPr>
+          <w:ilvl w:val="2"/>
           <w:numId w:val="22"/>
         </w:numPr>
       </w:pPr>
@@ -2270,7 +2368,21 @@
         <w:rPr>
           <w:rFonts w:hint="eastAsia"/>
         </w:rPr>
-        <w:t>メニュー（？）</w:t>
+        <w:t>レベルアップのための必要経験値の管理</w:t>
+      </w:r>
+    </w:p>
+    <w:p>
+      <w:pPr>
+        <w:numPr>
+          <w:ilvl w:val="2"/>
+          <w:numId w:val="22"/>
+        </w:numPr>
+      </w:pPr>
+      <w:r>
+        <w:rPr>
+          <w:rFonts w:hint="eastAsia"/>
+        </w:rPr>
+        <w:t>レベルアップ時のステータス強化</w:t>
       </w:r>
     </w:p>
     <w:p>
@@ -2284,7 +2396,49 @@
         <w:rPr>
           <w:rFonts w:hint="eastAsia"/>
         </w:rPr>
-        <w:t>インベントリとか、クエスト管理とかができるメニューを作りたい。</w:t>
+        <w:t>やられ処理</w:t>
+      </w:r>
+    </w:p>
+    <w:p>
+      <w:pPr>
+        <w:numPr>
+          <w:ilvl w:val="2"/>
+          <w:numId w:val="22"/>
+        </w:numPr>
+      </w:pPr>
+      <w:r>
+        <w:rPr>
+          <w:rFonts w:hint="eastAsia"/>
+        </w:rPr>
+        <w:t>キャラ交代とか？</w:t>
+      </w:r>
+    </w:p>
+    <w:p>
+      <w:pPr>
+        <w:numPr>
+          <w:ilvl w:val="2"/>
+          <w:numId w:val="22"/>
+        </w:numPr>
+      </w:pPr>
+      <w:r>
+        <w:rPr>
+          <w:rFonts w:hint="eastAsia"/>
+        </w:rPr>
+        <w:t>HP０のキャラは交代できないよう制限。これはプレイヤーマネージャーで監視</w:t>
+      </w:r>
+    </w:p>
+    <w:p>
+      <w:pPr>
+        <w:numPr>
+          <w:ilvl w:val="0"/>
+          <w:numId w:val="22"/>
+        </w:numPr>
+      </w:pPr>
+      <w:r>
+        <w:rPr>
+          <w:rFonts w:hint="eastAsia"/>
+        </w:rPr>
+        <w:t>ゲームオーバー</w:t>
       </w:r>
     </w:p>
     <w:p>
@@ -2298,7 +2452,7 @@
         <w:rPr>
           <w:rFonts w:hint="eastAsia"/>
         </w:rPr>
-        <w:t>現在欲しい機能は以下。</w:t>
+        <w:t>全キャラがHP０ならゲームオーバー。</w:t>
       </w:r>
     </w:p>
     <w:p>
@@ -2312,19 +2466,7 @@
         <w:rPr>
           <w:rFonts w:hint="eastAsia"/>
         </w:rPr>
-        <w:t>ボタン</w:t>
-      </w:r>
-      <w:r>
-        <w:rPr>
-          <w:rFonts w:hint="eastAsia"/>
-        </w:rPr>
-        <w:t>、ないしキー</w:t>
-      </w:r>
-      <w:r>
-        <w:rPr>
-          <w:rFonts w:hint="eastAsia"/>
-        </w:rPr>
-        <w:t>を押すとUIが表示される。</w:t>
+        <w:t>ダンジョン内なら入り口前に戻す？</w:t>
       </w:r>
     </w:p>
     <w:p>
@@ -2333,6 +2475,130 @@
           <w:ilvl w:val="2"/>
           <w:numId w:val="22"/>
         </w:numPr>
+        <w:rPr>
+          <w:rFonts w:hint="eastAsia"/>
+        </w:rPr>
+      </w:pPr>
+      <w:r>
+        <w:rPr>
+          <w:rFonts w:hint="eastAsia"/>
+        </w:rPr>
+        <w:t>ダンジョン外なら近くの村に移動？</w:t>
+      </w:r>
+    </w:p>
+    <w:p>
+      <w:pPr>
+        <w:numPr>
+          <w:ilvl w:val="0"/>
+          <w:numId w:val="22"/>
+        </w:numPr>
+      </w:pPr>
+      <w:r>
+        <w:rPr>
+          <w:rFonts w:hint="eastAsia"/>
+        </w:rPr>
+        <w:t>総合プレイヤーステータスの計算(Statusクラス)</w:t>
+      </w:r>
+    </w:p>
+    <w:p>
+      <w:pPr>
+        <w:numPr>
+          <w:ilvl w:val="1"/>
+          <w:numId w:val="22"/>
+        </w:numPr>
+      </w:pPr>
+      <w:r>
+        <w:rPr>
+          <w:rFonts w:hint="eastAsia"/>
+        </w:rPr>
+        <w:t>プレイヤーを引数に指定。そのプレイヤーの基礎ステータス、装備、バフを総合したステータスを返す。</w:t>
+      </w:r>
+    </w:p>
+    <w:p>
+      <w:pPr>
+        <w:ind w:left="1440"/>
+      </w:pPr>
+      <w:r>
+        <w:rPr>
+          <w:rFonts w:hint="eastAsia"/>
+        </w:rPr>
+        <w:t>※バフは実装してから。</w:t>
+      </w:r>
+    </w:p>
+    <w:p>
+      <w:pPr>
+        <w:numPr>
+          <w:ilvl w:val="0"/>
+          <w:numId w:val="22"/>
+        </w:numPr>
+      </w:pPr>
+      <w:r>
+        <w:rPr>
+          <w:rFonts w:hint="eastAsia"/>
+        </w:rPr>
+        <w:t>メニュー（？）</w:t>
+      </w:r>
+    </w:p>
+    <w:p>
+      <w:pPr>
+        <w:numPr>
+          <w:ilvl w:val="1"/>
+          <w:numId w:val="22"/>
+        </w:numPr>
+      </w:pPr>
+      <w:r>
+        <w:rPr>
+          <w:rFonts w:hint="eastAsia"/>
+        </w:rPr>
+        <w:t>インベントリとか、クエスト管理とかができるメニューを作りたい。</w:t>
+      </w:r>
+    </w:p>
+    <w:p>
+      <w:pPr>
+        <w:numPr>
+          <w:ilvl w:val="1"/>
+          <w:numId w:val="22"/>
+        </w:numPr>
+      </w:pPr>
+      <w:r>
+        <w:rPr>
+          <w:rFonts w:hint="eastAsia"/>
+        </w:rPr>
+        <w:t>現在欲しい機能は以下。</w:t>
+      </w:r>
+    </w:p>
+    <w:p>
+      <w:pPr>
+        <w:numPr>
+          <w:ilvl w:val="2"/>
+          <w:numId w:val="22"/>
+        </w:numPr>
+      </w:pPr>
+      <w:r>
+        <w:rPr>
+          <w:rFonts w:hint="eastAsia"/>
+        </w:rPr>
+        <w:t>ボタン</w:t>
+      </w:r>
+      <w:r>
+        <w:rPr>
+          <w:rFonts w:hint="eastAsia"/>
+        </w:rPr>
+        <w:t>、ないしキー</w:t>
+      </w:r>
+      <w:r>
+        <w:rPr>
+          <w:rFonts w:hint="eastAsia"/>
+        </w:rPr>
+        <w:t>を押すとUIが表示される。</w:t>
+      </w:r>
+    </w:p>
+    <w:p>
+      <w:pPr>
+        <w:numPr>
+          <w:ilvl w:val="2"/>
+          <w:numId w:val="22"/>
+        </w:numPr>
       </w:pPr>
       <w:r>
         <w:rPr>
@@ -2463,6 +2729,7 @@
         </w:numPr>
       </w:pPr>
       <w:r>
+        <w:lastRenderedPageBreak/>
         <w:t xml:space="preserve">報酬処理 </w:t>
       </w:r>
     </w:p>

</xml_diff>